<commit_message>
Release 2.4.15: Hall Analog A3 6-point (EEPROM V32), firmware zip and help 2.0.35.
Co-authored-by: Cursor <cursoragent@cursor.com>
</commit_message>
<xml_diff>
--- a/docs/ayuda_fr3d_es_revision.docx
+++ b/docs/ayuda_fr3d_es_revision.docx
@@ -382,6 +382,21 @@
     </w:p>
     <w:p>
       <w:pPr>
+        <w:spacing w:after="280" w:before="0" w:line="240" w:lineRule="auto"/>
+      </w:pPr>
+      <w:r>
+        <w:rPr>
+          <w:rFonts w:ascii="Calibri" w:hAnsi="Calibri" w:eastAsia="Calibri"/>
+          <w:b w:val="0"/>
+          <w:i/>
+          <w:color w:val="666666"/>
+          <w:sz w:val="18"/>
+        </w:rPr>
+        <w:t>Ver también (no editar): help.fr3d-addon.github, help.fr3d-addon.download, help.mk3, help.global, help.hardware, help.tips, help.tips.predictor-codes, help.global.help-panel</w:t>
+      </w:r>
+    </w:p>
+    <w:p>
+      <w:pPr>
         <w:pStyle w:val="Heading2"/>
       </w:pPr>
       <w:r>
@@ -1339,7 +1354,7 @@
           <w:i w:val="0"/>
           <w:sz w:val="22"/>
         </w:rPr>
-        <w:t>Source A3/USB/Manual, Pattern Diameter, Need Calibrate! / CALIBRATE, OFFSET.</w:t>
+        <w:t>Source A3/USB/Manual, 6-pt 1.5-2.0, Need Calibrate! / CALIBRATE, OFFSET.</w:t>
       </w:r>
     </w:p>
     <w:p>
@@ -1396,7 +1411,7 @@
           <w:i w:val="0"/>
           <w:sz w:val="22"/>
         </w:rPr>
-        <w:t>Pattern Diameter - Muestra Now (mm actuales, p. ej. 1.7/1.75/2.0) y solo Set del otro preset (Set 1.5/1.7/2.0 o Set 1.7/1.75/2.0). B (1.7/1.75/2.0) es el predeterminado de fábrica. Tras Set: pantalla "New Setting OK / Need Calibrate!!! / Click To calibrate"; el click abre Capture del primer punto. Cambiar patrón borra los 3 puntos y pone OFFSET (DOFF) en 0.</w:t>
+        <w:t>Firmware actual - Línea 6-pt 1.5-2.0 (sin Pattern A/B). Capture seis patrones físicos: 1.50, 1.60, 1.70, 1.80, 1.90, 2.00 mm. Click guarda ADC. CALV=1 solo si los seis ADC son distintos y monótonos. Flashear este firmware borra una cal Hall de 3 puntos previa (EEPROM V32).</w:t>
       </w:r>
     </w:p>
     <w:p>
@@ -1410,6 +1425,20 @@
           <w:i w:val="0"/>
           <w:sz w:val="22"/>
         </w:rPr>
+        <w:t>Firmware antiguo - Pattern Diameter muestra Now (p. ej. 1.7/1.75/2.0) y Set del otro preset (1.5/1.7/2.0 o 1.7/1.75/2.0). Cambiar patrón borra los 3 puntos y pone OFFSET (DOFF) en 0. La app web mantiene la UI A/B hasta reflashear el Mega.</w:t>
+      </w:r>
+    </w:p>
+    <w:p>
+      <w:pPr>
+        <w:spacing w:after="120" w:before="0" w:line="240" w:lineRule="auto"/>
+      </w:pPr>
+      <w:r>
+        <w:rPr>
+          <w:rFonts w:ascii="Calibri" w:hAnsi="Calibri" w:eastAsia="Calibri"/>
+          <w:b w:val="0"/>
+          <w:i w:val="0"/>
+          <w:sz w:val="22"/>
+        </w:rPr>
         <w:t>Need Calibrate! - Solo si la calibración está incompleta (CALV=0). Click abre la lista Capture. Si ya está calibrado (CALV=1), el menú muestra CALIBRATE.</w:t>
       </w:r>
     </w:p>
@@ -1424,7 +1453,7 @@
           <w:i w:val="0"/>
           <w:sz w:val="22"/>
         </w:rPr>
-        <w:t>CALIBRATE - Capture Lo/Mid/Hi con el patrón físico correspondiente (Click guarda ADC). Las etiquetas siguen el preset activo (p. ej. 1.50/1.70/2.00 o 1.70/1.75/2.00).</w:t>
+        <w:t>CALIBRATE - Capture cada mm etiquetado con el patrón físico correspondiente (Click guarda ADC).</w:t>
       </w:r>
     </w:p>
     <w:p>
@@ -11740,7 +11769,7 @@
           <w:i w:val="0"/>
           <w:sz w:val="22"/>
         </w:rPr>
-        <w:t>Fuente A3/USB/Manual, Pattern Diameter, MEDIR / APLICAR, DOFF.</w:t>
+        <w:t>Fuente A3/USB/Manual, cal A3 6 puntos (1.50–2.00), MEDIR / APLICAR, DOFF.</w:t>
       </w:r>
     </w:p>
     <w:p>
@@ -11831,7 +11860,7 @@
           <w:i w:val="0"/>
           <w:sz w:val="22"/>
         </w:rPr>
-        <w:t>Pattern Diameter - Muestra Now (mm actuales) y solo Set del otro preset. El preset B (1.7/1.75/2.0) es el predeterminado de fábrica; el preset A es 1.5/1.7/2.0. Cambiar patrón invalida la calibración (CALV=0), pone DOFF en 0 y muestra el banner Need Calibrate! hasta aplicar las 3 filas.</w:t>
+        <w:t>Calibración Analog A3 (firmware MK3 actual) - Un solo patrón de 6 puntos: 1.50, 1.60, 1.70, 1.80, 1.90, 2.00 mm. No hay cambio Pattern A/B. Coloque cada patrón físico, pulse MEDIR (ADC A3 en vivo) y APLICAR en la fila (guarda en MK3 + EEPROM). CALV=1 solo si los seis ADC son distintos y monótonos (todos suben o todos bajan). Flashear este firmware borra una cal Hall de 3 puntos previa (EEPROM V32).</w:t>
       </w:r>
     </w:p>
     <w:p>
@@ -11845,7 +11874,7 @@
           <w:i w:val="0"/>
           <w:sz w:val="22"/>
         </w:rPr>
-        <w:t>MEDIR / APLICAR - Coloque cada patrón de calibración, pulse MEDIR (ADC A3 en vivo) y APLICAR en la fila (guarda en MK3 + EEPROM). Las etiquetas siguen el preset activo.</w:t>
+        <w:t>Firmware MK3 antiguo (3 puntos) - Si el panel sigue mostrando Pattern Diameter A/B, el Mega no se reflasheó. El preset B (1.7/1.75/2.0) es el de fábrica; el A es 1.5/1.7/2.0. Capture Lo/Mid/Hi. La app web lo detecta sola (sin CALN,6) y mantiene la UI A/B.</w:t>
       </w:r>
     </w:p>
     <w:p>
@@ -11873,7 +11902,7 @@
           <w:i w:val="0"/>
           <w:sz w:val="22"/>
         </w:rPr>
-        <w:t>LCD: AddonFR3D -&gt; Diameter Sensor -&gt; Source / Pattern Diameter / Need Calibrate! o CALIBRATE.</w:t>
+        <w:t>LCD: AddonFR3D -&gt; Diameter Sensor -&gt; Source / 6-pt 1.5-2.0 / Need Calibrate! o CALIBRATE.</w:t>
         <w:br/>
         <w:t>Hardware: Ayuda -&gt; Hardware del sensor de diámetro.</w:t>
         <w:br/>
@@ -12683,7 +12712,7 @@
         <w:br/>
         <w:t>2) Sensor óptico de diámetro - basado en el sensor óptico ARTME 3D.</w:t>
         <w:br/>
-        <w:t>La calibración (Pattern Diameter / Capture) es la misma en LCD y en CONFIG web.</w:t>
+        <w:t>La calibración (Capture 6 puntos 1.50…2.00 mm, o Pattern A/B en firmware antiguo) es la misma en LCD y en CONFIG web.</w:t>
       </w:r>
     </w:p>
     <w:p>
@@ -15094,13 +15123,13 @@
         </w:rPr>
         <w:t>- Voltaje en el pin A3 - Con fuente Analógico A3, mida la señal Hall/óptica en el pin A3 del Mega. Un cable cortado, en corto o suelto deja un voltaje fijo y el Ø no se mueve.</w:t>
         <w:br/>
-        <w:t>- Limpie el sensor - Polvo, viruta y grasa en el camino Hall u óptico congelan la lectura. Limpie la guía y la cara de medición, y vuelva a capturar Lo / Mid / Hi.</w:t>
+        <w:t>- Limpie el sensor - Polvo, viruta y grasa en el camino Hall u óptico congelan la lectura. Limpie la guía y la cara de medición, y vuelva a capturar los seis puntos (o Lo / Mid / Hi en firmware antiguo).</w:t>
         <w:br/>
         <w:t>- Compruebe que el Ø no está estático - Cambie el diámetro físico (cambie un patrón de calibración, o apriete la hebra con cuidado). DXXXX en la pantalla principal debe cambiar. Si queda congelado, el sensor no ve el filamento: cableado, Source (A3 vs USB vs Manual) o suciedad.</w:t>
         <w:br/>
-        <w:t>- Complete las 3 filas Capture (Lo / Mid / Hi) hasta CALV=1. El predictor no actúa hasta entonces.</w:t>
+        <w:t>- Complete todas las filas Capture hasta CALV=1 (seis puntos 1.50…2.00 en firmware actual; Lo / Mid / Hi en el antiguo). Los seis ADC deben ser distintos y monótonos. El predictor no actúa hasta entonces.</w:t>
         <w:br/>
-        <w:t>- Tras Set de Pattern Diameter la calibración se borra: capture de nuevo.</w:t>
+        <w:t>- Si Need Calibrate! queda con seis ADC iguales, A3 no ve un sensor real (pin abierto). Corrija el cableado o recapture con patrones reales.</w:t>
       </w:r>
     </w:p>
     <w:p>
@@ -15828,7 +15857,7 @@
         <w:br/>
         <w:t>AS  Espera tras un cambio de temperatura. Espere.</w:t>
         <w:br/>
-        <w:t>AC  Sensor sin calibrar. Termine Need Calibrate! (3 filas).</w:t>
+        <w:t>AC  Sensor sin calibrar. Termine Need Calibrate! (6 filas en FW actual; 3 en el antiguo).</w:t>
         <w:br/>
         <w:t>AO  Hall apagado (no debería ocurrir en el firmware actual).</w:t>
         <w:br/>

</xml_diff>